<commit_message>
Refonte méthodologique : correction beta vs pairs, marge pondérée, g terminal différencié, prise de position sur écarts consensus
</commit_message>
<xml_diff>
--- a/ko_note_synthese.docx
+++ b/ko_note_synthese.docx
@@ -16,7 +16,7 @@
           <w:i/>
           <w:color w:val="808080"/>
         </w:rPr>
-        <w:t>Date : 21/09/2026</w:t>
+        <w:t>Date : 26/09/2026 — Boissons — modèle de franchise de concentré</w:t>
       </w:r>
     </w:p>
     <w:p>
@@ -32,13 +32,10 @@
         <w:rPr>
           <w:b/>
         </w:rPr>
-        <w:t xml:space="preserve">Valeur par action (DCF, scénario Base) : </w:t>
+        <w:t xml:space="preserve">Fourchette de valorisation : </w:t>
       </w:r>
       <w:r>
-        <w:t>$54.20</w:t>
-      </w:r>
-      <w:r>
-        <w:t xml:space="preserve">  (-38.6% vs cours actuel)</w:t>
+        <w:t>$26.59 — $104.00</w:t>
       </w:r>
     </w:p>
     <w:p>
@@ -46,13 +43,16 @@
         <w:rPr>
           <w:b/>
         </w:rPr>
-        <w:t xml:space="preserve">Valeur par action (Comparables, moyenne) : </w:t>
+        <w:t xml:space="preserve">Prix cible : </w:t>
       </w:r>
       <w:r>
-        <w:t>$49.15</w:t>
+        <w:rPr>
+          <w:b/>
+        </w:rPr>
+        <w:t>$63.49</w:t>
       </w:r>
       <w:r>
-        <w:t xml:space="preserve">  (-44.3% vs cours actuel)</w:t>
+        <w:t xml:space="preserve">  (-27.7% vs cours actuel)</w:t>
       </w:r>
     </w:p>
     <w:p>
@@ -60,10 +60,13 @@
         <w:rPr>
           <w:b/>
         </w:rPr>
-        <w:t xml:space="preserve">Marge d'EBIT retenue (moyenne historique 3 ans) : </w:t>
+        <w:t xml:space="preserve">Cours actuel : </w:t>
       </w:r>
       <w:r>
-        <w:t>29.8%</w:t>
+        <w:t>$87.81</w:t>
+      </w:r>
+      <w:r>
+        <w:t xml:space="preserve"> — dans le tiers supérieur de la fourchette de valorisation</w:t>
       </w:r>
     </w:p>
     <w:p>
@@ -71,32 +74,15 @@
         <w:rPr>
           <w:b/>
         </w:rPr>
-        <w:t xml:space="preserve">Recommandation : </w:t>
+        <w:t xml:space="preserve">Composantes du prix cible (moyenne simple, aucune méthode exclue) : </w:t>
       </w:r>
       <w:r>
-        <w:rPr>
-          <w:b/>
-        </w:rPr>
-        <w:t>Vente (Sell)</w:t>
-      </w:r>
-      <w:r>
-        <w:t xml:space="preserve">  (upside moyen implicite : -41.4%)</w:t>
+        <w:t>DCF (Base) $46.72, Comparables (moyenne) $49.04, Consensus analystes $94.70</w:t>
       </w:r>
     </w:p>
     <w:p>
       <w:r>
-        <w:rPr>
-          <w:i/>
-        </w:rPr>
-        <w:t>Cette recommandation prend le DCF comme ancre (c'est la méthode la plus rigoureuse, fondée sur les flux de trésorerie réels) et moyenne son upside implicite avec celui des comparables et du consensus analystes — sauf si l'une de ces deux méthodes s'écarte du DCF de plus de 30 points de pourcentage, auquel cas elle est exclue de la moyenne plutôt que d'y être mélangée : une méthode bruitée (un multiple de pair faussé par un résultat exceptionnel, par exemple) ne doit pas pouvoir, à elle seule, inverser le sens de la recommandation. Le titre est classé en Achat si l'upside moyen ainsi calculé dépasse +15 %, en Vente s'il est inférieur à -10 %, et en Conserver entre les deux. C'est un point de départ mécanique et documenté, pas un jugement définitif : il ne remplace pas une analyse qualitative des catalyseurs et risques propres à la thèse d'investissement (voir sections 7 et 8).</w:t>
-      </w:r>
-    </w:p>
-    <w:p>
-      <w:r>
-        <w:rPr>
-          <w:i/>
-        </w:rPr>
-        <w:t>Méthode(s) exclue(s) de la moyenne : Consensus analystes (+7.3%, écart de 46 pts vs DCF).</w:t>
+        <w:t>Le prix cible ci-dessus moyenne à parts égales le DCF (scénario Base), la moyenne des comparables et le consensus analystes lorsqu'ils sont disponibles — aucune méthode n'est écartée sur la base d'un écart mécanique. La fourchette (Bear/Bull du DCF, bornes des comparables, range du consensus, range 52 semaines) donne l'amplitude réaliste du titre ; un écart significatif entre valeur intrinsèque (DCF) et valeur de marché (comparables) est interprété en section 4 — Thèse d'investissement — plutôt que masqué.</w:t>
       </w:r>
     </w:p>
     <w:p>
@@ -109,12 +95,51 @@
     </w:p>
     <w:p>
       <w:r>
-        <w:t>WACC et hypothèses de croissance : voir l'onglet "DCF - Modèle" du classeur Excel.</w:t>
+        <w:t>Hypothèses de croissance et de marge détaillées année par année : voir l'onglet "DCF - Modèle" du classeur Excel.</w:t>
       </w:r>
     </w:p>
     <w:p>
       <w:r>
-        <w:t>La marge d'EBIT retenue (29.8%) est la moyenne des 3 derniers exercices réels, et non une hypothèse arbitraire. Point de vigilance : si cette marge suit une tendance marquée (en hausse ou en baisse) sur la période observée, la moyenne peut être trop optimiste ou trop conservatrice selon le sens de la tendance — comparer la marge retenue à la marge du dernier exercice seul permet de vérifier ce biais avant de présenter le chiffre.</w:t>
+        <w:rPr>
+          <w:b/>
+        </w:rPr>
+        <w:t xml:space="preserve">Beta retenu : </w:t>
+      </w:r>
+      <w:r>
+        <w:t>Beta brut (0.34) dans la plage plausible mais s'écarte de 39% du beta moyen des pairs (0.56) — écart jugé trop important pour être retenu tel quel -&gt; beta moyen des pairs retenu par prudence. À vérifier auprès d'une source indépendante (Bloomberg/Refinitiv) avant diffusion finale.</w:t>
+      </w:r>
+    </w:p>
+    <w:p>
+      <w:r>
+        <w:rPr>
+          <w:b/>
+        </w:rPr>
+        <w:t xml:space="preserve">Marge d'EBIT retenue : </w:t>
+      </w:r>
+      <w:r>
+        <w:rPr>
+          <w:b/>
+        </w:rPr>
+        <w:t>30.3%</w:t>
+      </w:r>
+      <w:r>
+        <w:t xml:space="preserve"> — détail annuel : 2023 : 28.6%, 2024 : 29.8%, 2025 : 31.1%.</w:t>
+      </w:r>
+    </w:p>
+    <w:p>
+      <w:r>
+        <w:t>La marge suit une tendance haussière sur la période observée. Plutôt que de se contenter de le signaler, la marge retenue ci-dessus est une moyenne pondérée donnant davantage de poids aux exercices récents, contre 29.8% en moyenne simple — cette pondération corrige le biais qu'une moyenne plate introduirait sur une tendance haussière.</w:t>
+      </w:r>
+    </w:p>
+    <w:p>
+      <w:r>
+        <w:rPr>
+          <w:b/>
+        </w:rPr>
+        <w:t xml:space="preserve">Croissance terminale : </w:t>
+      </w:r>
+      <w:r>
+        <w:t>Croissance terminale retenue à 2,5% (au-dessus de l'hypothèse générique de 2,0%) : exposition structurelle aux marchés émergents, où la consommation par habitant reste inférieure aux marchés matures, et pricing power démontré sur le portefeuille de marques — deux éléments qui justifient une croissance long terme légèrement supérieure à la seule inflation américaine.</w:t>
       </w:r>
     </w:p>
     <w:p>
@@ -199,7 +224,7 @@
           </w:tcPr>
           <w:p>
             <w:r>
-              <w:t>12.64</w:t>
+              <w:t>12.39</w:t>
             </w:r>
           </w:p>
         </w:tc>
@@ -209,7 +234,7 @@
           </w:tcPr>
           <w:p>
             <w:r>
-              <w:t>236,337</w:t>
+              <w:t>231,783</w:t>
             </w:r>
           </w:p>
         </w:tc>
@@ -231,7 +256,7 @@
           </w:tcPr>
           <w:p>
             <w:r>
-              <w:t>3.17</w:t>
+              <w:t>3.12</w:t>
             </w:r>
           </w:p>
         </w:tc>
@@ -241,7 +266,7 @@
           </w:tcPr>
           <w:p>
             <w:r>
-              <w:t>152,141</w:t>
+              <w:t>149,648</w:t>
             </w:r>
           </w:p>
         </w:tc>
@@ -263,7 +288,7 @@
           </w:tcPr>
           <w:p>
             <w:r>
-              <w:t>24.14</w:t>
+              <w:t>24.57</w:t>
             </w:r>
           </w:p>
         </w:tc>
@@ -273,7 +298,7 @@
           </w:tcPr>
           <w:p>
             <w:r>
-              <w:t>316,390</w:t>
+              <w:t>321,981</w:t>
             </w:r>
           </w:p>
         </w:tc>
@@ -281,7 +306,117 @@
     </w:tbl>
     <w:p>
       <w:r>
-        <w:t>Point de vigilance à discuter : des comparables issus d'un même secteur peuvent avoir des profils très différents (mix d'activités, exposition géographique, structure de capital) qui justifient une décote ou une prime par rapport à la médiane — à documenter explicitement plutôt que d'appliquer le multiple médian sans ajustement.</w:t>
+        <w:t>Passerelle Enterprise Value → Equity Value : pour les méthodes EV/EBITDA et EV/Sales, la valeur implicite ci-dessus est une valeur d'entreprise (EV) — la dette nette est déduite avant division par le nombre d'actions pour obtenir la valeur par action (voir tableau ci-dessous). La méthode P/E aboutit directement à une valeur de capitaux propres et n'a pas besoin de cet ajustement. Par simplification, aucun intérêt minoritaire ni action préférentielle n'est retraité ici (donnée non disponible de façon fiable via l'extraction automatisée) — à vérifier manuellement si la structure de capital de la société en comporte.</w:t>
+      </w:r>
+    </w:p>
+    <w:tbl>
+      <w:tblPr>
+        <w:tblStyle w:val="LightGrid-Accent1"/>
+        <w:tblW w:type="auto" w:w="0"/>
+        <w:tblLook w:firstColumn="1" w:firstRow="1" w:lastColumn="0" w:lastRow="0" w:noHBand="0" w:noVBand="1" w:val="04A0"/>
+      </w:tblPr>
+      <w:tblGrid>
+        <w:gridCol w:w="4320"/>
+        <w:gridCol w:w="4320"/>
+      </w:tblGrid>
+      <w:tr>
+        <w:tc>
+          <w:tcPr>
+            <w:tcW w:type="dxa" w:w="4320"/>
+          </w:tcPr>
+          <w:p>
+            <w:r>
+              <w:rPr>
+                <w:b/>
+              </w:rPr>
+              <w:t>Méthode</w:t>
+            </w:r>
+          </w:p>
+        </w:tc>
+        <w:tc>
+          <w:tcPr>
+            <w:tcW w:type="dxa" w:w="4320"/>
+          </w:tcPr>
+          <w:p>
+            <w:r>
+              <w:rPr>
+                <w:b/>
+              </w:rPr>
+              <w:t>Valeur par action implicite</w:t>
+            </w:r>
+          </w:p>
+        </w:tc>
+      </w:tr>
+      <w:tr>
+        <w:tc>
+          <w:tcPr>
+            <w:tcW w:type="dxa" w:w="4320"/>
+          </w:tcPr>
+          <w:p>
+            <w:r>
+              <w:t>EV/EBITDA</w:t>
+            </w:r>
+          </w:p>
+        </w:tc>
+        <w:tc>
+          <w:tcPr>
+            <w:tcW w:type="dxa" w:w="4320"/>
+          </w:tcPr>
+          <w:p>
+            <w:r>
+              <w:t>$45.68</w:t>
+            </w:r>
+          </w:p>
+        </w:tc>
+      </w:tr>
+      <w:tr>
+        <w:tc>
+          <w:tcPr>
+            <w:tcW w:type="dxa" w:w="4320"/>
+          </w:tcPr>
+          <w:p>
+            <w:r>
+              <w:t>EV/Sales</w:t>
+            </w:r>
+          </w:p>
+        </w:tc>
+        <w:tc>
+          <w:tcPr>
+            <w:tcW w:type="dxa" w:w="4320"/>
+          </w:tcPr>
+          <w:p>
+            <w:r>
+              <w:t>$26.59</w:t>
+            </w:r>
+          </w:p>
+        </w:tc>
+      </w:tr>
+      <w:tr>
+        <w:tc>
+          <w:tcPr>
+            <w:tcW w:type="dxa" w:w="4320"/>
+          </w:tcPr>
+          <w:p>
+            <w:r>
+              <w:t>P/E</w:t>
+            </w:r>
+          </w:p>
+        </w:tc>
+        <w:tc>
+          <w:tcPr>
+            <w:tcW w:type="dxa" w:w="4320"/>
+          </w:tcPr>
+          <w:p>
+            <w:r>
+              <w:t>$74.83</w:t>
+            </w:r>
+          </w:p>
+        </w:tc>
+      </w:tr>
+    </w:tbl>
+    <w:p>
+      <w:r>
+        <w:t>Marge d'EBITDA de la cible (39.0%) très supérieure à la marge d'EBITDA implicite moyenne des pairs (26.0%, dérivée du rapport EV/Sales ÷ EV/EBITDA de chaque pair). Ceci justifie que la société se paie une prime de multiple par rapport à la médiane brute du panel plutôt qu'une application mécanique du multiple médian.</w:t>
       </w:r>
     </w:p>
     <w:p>
@@ -289,7 +424,73 @@
         <w:pStyle w:val="Heading1"/>
       </w:pPr>
       <w:r>
-        <w:t>4. Scénarios (Bear / Base / Bull)</w:t>
+        <w:t>4. Thèse d'investissement</w:t>
+      </w:r>
+    </w:p>
+    <w:p>
+      <w:pPr>
+        <w:pStyle w:val="Heading2"/>
+      </w:pPr>
+      <w:r>
+        <w:t>4.1 Catalyseurs de croissance</w:t>
+      </w:r>
+    </w:p>
+    <w:p>
+      <w:pPr>
+        <w:pStyle w:val="ListBullet"/>
+      </w:pPr>
+      <w:r>
+        <w:t>Pricing power et gestion active du mix (revenue growth management) sur un portefeuille de marques à forte notoriété, avec une capacité démontrée à répercuter l'inflation des intrants sans érosion durable des volumes.</w:t>
+      </w:r>
+    </w:p>
+    <w:p>
+      <w:pPr>
+        <w:pStyle w:val="ListBullet"/>
+      </w:pPr>
+      <w:r>
+        <w:t>Diversification au-delà du soda classique (eaux, boissons énergétiques, cafés/thés prêts à boire) et expansion continue sur les marchés émergents, où la consommation par habitant reste inférieure aux marchés matures.</w:t>
+      </w:r>
+    </w:p>
+    <w:p>
+      <w:pPr>
+        <w:pStyle w:val="ListBullet"/>
+      </w:pPr>
+      <w:r>
+        <w:t>Exécution commerciale digitale renforcée avec le réseau d'embouteilleurs partenaires, améliorant la disponibilité produit et l'efficacité promotionnelle.</w:t>
+      </w:r>
+    </w:p>
+    <w:p>
+      <w:pPr>
+        <w:pStyle w:val="Heading2"/>
+      </w:pPr>
+      <w:r>
+        <w:t>4.2 Solidité du modèle économique</w:t>
+      </w:r>
+    </w:p>
+    <w:p>
+      <w:r>
+        <w:t>Le modèle de franchise de concentré est structurellement asset-light : The Coca-Cola Company possède la marque et la formule, mais délègue l'essentiel de l'embouteillage et de la distribution — capitalistiques — à un réseau de partenaires embouteilleurs (dont Coca-Cola Europacific Partners et Coca-Cola FEMSA sur une partie des marchés). Cette structure explique la marge d'EBITDA élevée et la forte conversion en free cash flow du groupe par rapport aux capitaux employés.</w:t>
+      </w:r>
+    </w:p>
+    <w:p>
+      <w:pPr>
+        <w:pStyle w:val="Heading2"/>
+      </w:pPr>
+      <w:r>
+        <w:t>4.3 Analyse de l'écart DCF vs Multiples</w:t>
+      </w:r>
+    </w:p>
+    <w:p>
+      <w:r>
+        <w:t>Écart entre la moyenne des comparables et le DCF (scénario Base) : +5.0%. Les comparables (multiples de marché) intègrent souvent une prime pour la puissance de marque et la structure capitalistique légère du modèle — un DCF aux hypothèses de croissance et de marge conservatrices peut donc sous-évaluer cette qualité. À l'inverse, si le DCF ressort au-dessus des multiples, cela peut signaler que le marché price un risque (taux, change) supérieur à celui implicite dans le WACC retenu.</w:t>
+      </w:r>
+    </w:p>
+    <w:p>
+      <w:pPr>
+        <w:pStyle w:val="Heading1"/>
+      </w:pPr>
+      <w:r>
+        <w:t>5. Scénarios (Bear / Base / Bull)</w:t>
       </w:r>
     </w:p>
     <w:p>
@@ -352,7 +553,7 @@
           </w:tcPr>
           <w:p>
             <w:r>
-              <w:t>$34.02</w:t>
+              <w:t>$30.02</w:t>
             </w:r>
           </w:p>
         </w:tc>
@@ -374,7 +575,7 @@
           </w:tcPr>
           <w:p>
             <w:r>
-              <w:t>$54.20</w:t>
+              <w:t>$46.72</w:t>
             </w:r>
           </w:p>
         </w:tc>
@@ -396,7 +597,7 @@
           </w:tcPr>
           <w:p>
             <w:r>
-              <w:t>$87.82</w:t>
+              <w:t>$72.47</w:t>
             </w:r>
           </w:p>
         </w:tc>
@@ -404,7 +605,7 @@
     </w:tbl>
     <w:p>
       <w:r>
-        <w:t>L'écart entre les scénarios Bear et Bull représente 158% de la valeur du scénario Bear — cette amplitude reflète surtout la sensibilité mécanique du DCF au WACC et à la croissance terminale plus qu'une vraie distribution de probabilité des issues possibles. Les deltas Bear/Bull appliqués par défaut sont génériques : à recalibrer avec une analyse sectorielle spécifique (scénarios de prix des matières premières, régulation, cycle de la demande) avant de les présenter comme définitifs.</w:t>
+        <w:t>L'écart entre les scénarios Bear et Bull représente 141% de la valeur du scénario Bear. Les deltas Bear/Bull appliqués par défaut sont génériques : à recalibrer avec une analyse sectorielle spécifique avant de les présenter comme définitifs (voir section 6 pour les risques propres à cette recalibration).</w:t>
       </w:r>
     </w:p>
     <w:p>
@@ -412,7 +613,7 @@
         <w:pStyle w:val="Heading1"/>
       </w:pPr>
       <w:r>
-        <w:t>5. Comparaison au consensus analystes</w:t>
+        <w:t>6. Comparaison au consensus analystes</w:t>
       </w:r>
     </w:p>
     <w:p>
@@ -422,7 +623,7 @@
     </w:p>
     <w:p>
       <w:r>
-        <w:t>Le consensus est sensiblement plus optimiste que le DCF Base (+7.3% contre -38.6% d'upside implicite). Un écart de cet ordre suggère que les analystes intègrent des éléments que le DCF ne capture pas explicitement ici — catalyseurs de croissance (nouveaux projets, M&amp;A), révisions de guidance récentes, ou au contraire des risques réglementaires/sectoriels non reflétés dans les hypothèses par défaut. À creuser avant de trancher entre les deux.</w:t>
+        <w:t>Le consensus est très sensiblement plus optimiste que le DCF Base (+102.7% d'écart) — un écart trop large pour être expliqué par la seule prime de qualité évoquée en section 4.3. Position retenue : corriger le WACC vers un beta plus défendable (voir section 2) réduit encore la valeur intrinsèque plutôt que de la rapprocher du consensus — l'écart n'est donc pas un artefact de modélisation qui se résorberait avec des hypothèses plus fines. Le consensus est traité comme un scénario haut nécessitant un catalyseur de re-rating confirmé (accélération de croissance internationale, effet de portefeuille M&amp;A) avant d'être rapproché du prix cible ; en son absence, le DCF reste l'ancre du prix cible et le consensus n'est utilisé que comme borne supérieure de la fourchette.</w:t>
       </w:r>
     </w:p>
     <w:p>
@@ -430,17 +631,12 @@
         <w:pStyle w:val="Heading1"/>
       </w:pPr>
       <w:r>
-        <w:t>6. Analyse de sensibilité</w:t>
+        <w:t>7. Football Field</w:t>
       </w:r>
     </w:p>
     <w:p>
       <w:r>
-        <w:t>Voir l'onglet "DCF - Sensibilité" et le graphique "Football Field" du classeur Excel.</w:t>
-      </w:r>
-    </w:p>
-    <w:p>
-      <w:r>
-        <w:t>Le tableau de sensibilité croise le WACC et la croissance terminale : c'est le point de départ pour évaluer la robustesse de la thèse d'investissement — si la recommandation ne change de sens que dans un coin extrême de la grille (WACC très bas ET croissance très haute, par exemple), la conviction peut être plus forte que si elle bascule au moindre ajustement raisonnable des hypothèses.</w:t>
+        <w:t>Le graphique "Football Field" du classeur Excel synthétise l'ensemble des méthodes sur une même échelle : range 52 semaines (marché), DCF (Bear/Base/Bull), comparables (EV/EBITDA, EV/Sales, P/E), et prix cible du consensus analystes. C'est la vue d'ensemble à présenter en comité — chaque barre représente une méthode indépendante, sans qu'aucune ne soit retirée du visuel.</w:t>
       </w:r>
     </w:p>
     <w:p>
@@ -448,7 +644,7 @@
         <w:pStyle w:val="Heading1"/>
       </w:pPr>
       <w:r>
-        <w:t>7. Sources et hypothèses</w:t>
+        <w:t>8. Sources et hypothèses</w:t>
       </w:r>
     </w:p>
     <w:p>
@@ -526,7 +722,12 @@
         <w:pStyle w:val="Heading1"/>
       </w:pPr>
       <w:r>
-        <w:t>8. Risques et limites</w:t>
+        <w:t>9. Risques et limites</w:t>
+      </w:r>
+    </w:p>
+    <w:p>
+      <w:r>
+        <w:t>Risques sectoriels spécifiques :</w:t>
       </w:r>
     </w:p>
     <w:p>
@@ -534,7 +735,7 @@
         <w:pStyle w:val="ListBullet"/>
       </w:pPr>
       <w:r>
-        <w:t>Sensibilité du DCF au WACC et à la croissance terminale : un écart de quelques dixièmes de point sur l'une ou l'autre hypothèse peut faire varier la valeur par action de plusieurs dizaines de pourcents (voir l'onglet Sensibilité) — la conclusion de cette note doit donc être lue comme une fourchette raisonnable, pas un chiffre précis.</w:t>
+        <w:t>Matières premières : le sucre, l'aluminium (canettes) et le PET représentent une part significative des coûts variables ; une hausse durable de ces cours pèse sur la marge si elle ne peut être intégralement répercutée sur le prix.</w:t>
       </w:r>
     </w:p>
     <w:p>
@@ -542,7 +743,7 @@
         <w:pStyle w:val="ListBullet"/>
       </w:pPr>
       <w:r>
-        <w:t>Risque sur les prix des matières premières / de l'énergie : pour une activité exposée aux cours du pétrole, du gaz ou de l'électricité, une variation durable des prix de marché a un impact direct sur le chiffre d'affaires et les marges — un impact que la croissance moyenne lissée utilisée dans ce DCF ne capture pas explicitement.</w:t>
+        <w:t>Risque de change (FX) : une forte exposition internationale expose les résultats consolidés en USD aux effets de conversion, indépendamment de la performance opérationnelle locale en devise constante.</w:t>
       </w:r>
     </w:p>
     <w:p>
@@ -550,7 +751,12 @@
         <w:pStyle w:val="ListBullet"/>
       </w:pPr>
       <w:r>
-        <w:t>Risque réglementaire et de transition énergétique : évolution de la fiscalité carbone, des subventions aux renouvelables, ou des contraintes d'émissions, qui peut modifier l'allocation de capital de l'entreprise entre activités historiques et nouvelles filières.</w:t>
+        <w:t>Risque réglementaire : taxes sur les boissons sucrées (soda tax) dans un nombre croissant de juridictions, et durcissement des obligations de recyclage / responsabilité élargie du producteur sur les emballages plastiques.</w:t>
+      </w:r>
+    </w:p>
+    <w:p>
+      <w:r>
+        <w:t>Limites méthodologiques :</w:t>
       </w:r>
     </w:p>
     <w:p>
@@ -558,7 +764,7 @@
         <w:pStyle w:val="ListBullet"/>
       </w:pPr>
       <w:r>
-        <w:t>Risque géopolitique : exposition à des zones de production ou de marché sensibles (sanctions, instabilité politique, nationalisation) pouvant affecter tout ou partie des actifs ou des débouchés commerciaux.</w:t>
+        <w:t>Sensibilité du DCF au WACC et à la croissance terminale : un écart de quelques dixièmes de point sur l'une ou l'autre hypothèse peut faire varier la valeur par action de plusieurs dizaines de pourcents (voir l'onglet Sensibilité du classeur) — la fourchette de cette note doit être lue comme telle, pas comme un chiffre unique.</w:t>
       </w:r>
     </w:p>
     <w:p>
@@ -566,7 +772,7 @@
         <w:pStyle w:val="ListBullet"/>
       </w:pPr>
       <w:r>
-        <w:t>Les scénarios Bear/Bull appliquent des deltas génériques (± delta fixe sur la marge, courbes de croissance par défaut) — à recalibrer avec une analyse sectorielle spécifique plutôt que de garder les valeurs par défaut du script.</w:t>
+        <w:t>Échantillon de comparables limité : un multiple individuel atypique peut encore peser significativement sur la médiane malgré l'élargissement du panel.</w:t>
       </w:r>
     </w:p>
     <w:p>
@@ -574,7 +780,7 @@
         <w:pStyle w:val="ListBullet"/>
       </w:pPr>
       <w:r>
-        <w:t>Le beta utilisé peut être une valeur de repli (voir alerte dans les logs d'exécution si c'est le cas) : à vérifier auprès d'une source indépendante avant de figer le WACC.</w:t>
+        <w:t>Le beta utilisé peut être une valeur de repli sectorielle (voir alerte dans les logs d'exécution si c'est le cas) : à vérifier auprès d'une source indépendante avant de figer le WACC.</w:t>
       </w:r>
     </w:p>
     <w:p>
@@ -582,12 +788,12 @@
         <w:pStyle w:val="Heading1"/>
       </w:pPr>
       <w:r>
-        <w:t>9. Conclusion</w:t>
+        <w:t>10. Conclusion</w:t>
       </w:r>
     </w:p>
     <w:p>
       <w:r>
-        <w:t>Le DCF (scénario Base) valorise KO à $54.20 par action, soit -38.6% par rapport au cours actuel. L'approche par comparables aboutit à une moyenne de $49.15 (-44.3%), et le consensus des analystes se situe à $94.70 (+7.3%). Sur la base de la règle d'upside moyen documentée en section 1, la recommandation retenue est Vente (Sell). L'upside moyen implicite est négatif : au cours actuel, les trois méthodes suggèrent une valorisation de marché supérieure à ce que justifient les flux de trésorerie projetés et les multiples de comparables. Ceci doit être confronté à un narratif de marché éventuellement plus optimiste (catalyseurs non capturés par le DCF) avant de conclure définitivement à une survalorisation.</w:t>
+        <w:t>KO se valorise dans une fourchette de $26.59 à $104.00 selon l'ensemble des méthodes retenues, pour un prix cible de $63.49 (-27.7% vs cours actuel). Le cours actuel se situe dans le tiers supérieur de la fourchette de valorisation. Cette conclusion s'appuie sur la thèse d'investissement détaillée en section 4 (catalyseurs de croissance, solidité du modèle, lecture de l'écart DCF/multiples) et doit être confrontée aux risques sectoriels de la section 9 avant toute décision.</w:t>
       </w:r>
     </w:p>
     <w:sectPr>

</xml_diff>